<commit_message>
Complete Review 2 submission validation and generate Review 3 with architectural comparison and justification
</commit_message>
<xml_diff>
--- a/documentation/BAITE203_Lab_Assessment_Review2_Refined_Format.docx
+++ b/documentation/BAITE203_Lab_Assessment_Review2_Refined_Format.docx
@@ -4349,15 +4349,8 @@
         <w:keepNext/>
         <w:spacing w:before="180" w:after="80"/>
       </w:pPr>
-      <w:r/>
       <w:r>
-        <w:rPr>
-          <w:rFonts w:ascii="Lato" w:hAnsi="Lato"/>
-          <w:b/>
-          <w:color w:val="0E6C78"/>
-          <w:sz w:val="22"/>
-        </w:rPr>
-        <w:t>4.2 Comparative Latency and Jitter Telemetry Across Campus Sectors</w:t>
+        <w:t>4.3 Comparative Latency and Jitter Telemetry Across Campus Sectors</w:t>
       </w:r>
     </w:p>
     <w:p>
@@ -5442,15 +5435,8 @@
         <w:keepNext/>
         <w:spacing w:before="180" w:after="80"/>
       </w:pPr>
-      <w:r/>
       <w:r>
-        <w:rPr>
-          <w:rFonts w:ascii="Lato" w:hAnsi="Lato"/>
-          <w:b/>
-          <w:color w:val="0E6C78"/>
-          <w:sz w:val="22"/>
-        </w:rPr>
-        <w:t>4.3 Summary of Implementation &amp; Evaluation Findings</w:t>
+        <w:t>4.4 Summary of Implementation &amp; Evaluation Findings</w:t>
       </w:r>
     </w:p>
     <w:p>

</xml_diff>